<commit_message>
Added DMR data download that should have been added earlier
</commit_message>
<xml_diff>
--- a/SOP.docx
+++ b/SOP.docx
@@ -1,6 +1,6 @@
 
 <file path=word/document.xml><?xml version="1.0" encoding="utf-8"?>
-<w:document xmlns:wpc="http://schemas.microsoft.com/office/word/2010/wordprocessingCanvas" xmlns:cx="http://schemas.microsoft.com/office/drawing/2014/chartex" xmlns:cx1="http://schemas.microsoft.com/office/drawing/2015/9/8/chartex" xmlns:cx2="http://schemas.microsoft.com/office/drawing/2015/10/21/chartex" xmlns:cx3="http://schemas.microsoft.com/office/drawing/2016/5/9/chartex" xmlns:cx4="http://schemas.microsoft.com/office/drawing/2016/5/10/chartex" xmlns:cx5="http://schemas.microsoft.com/office/drawing/2016/5/11/chartex" xmlns:cx6="http://schemas.microsoft.com/office/drawing/2016/5/12/chartex" xmlns:cx7="http://schemas.microsoft.com/office/drawing/2016/5/13/chartex" xmlns:cx8="http://schemas.microsoft.com/office/drawing/2016/5/14/chartex" xmlns:mc="http://schemas.openxmlformats.org/markup-compatibility/2006" xmlns:aink="http://schemas.microsoft.com/office/drawing/2016/ink" xmlns:am3d="http://schemas.microsoft.com/office/drawing/2017/model3d" xmlns:o="urn:schemas-microsoft-com:office:office" xmlns:oel="http://schemas.microsoft.com/office/2019/extlst" xmlns:r="http://schemas.openxmlformats.org/officeDocument/2006/relationships" xmlns:m="http://schemas.openxmlformats.org/officeDocument/2006/math" xmlns:v="urn:schemas-microsoft-com:vml" xmlns:wp14="http://schemas.microsoft.com/office/word/2010/wordprocessingDrawing" xmlns:wp="http://schemas.openxmlformats.org/drawingml/2006/wordprocessingDrawing" xmlns:w10="urn:schemas-microsoft-com:office:word" xmlns:w="http://schemas.openxmlformats.org/wordprocessingml/2006/main" xmlns:w14="http://schemas.microsoft.com/office/word/2010/wordml" xmlns:w15="http://schemas.microsoft.com/office/word/2012/wordml" xmlns:w16cex="http://schemas.microsoft.com/office/word/2018/wordml/cex" xmlns:w16cid="http://schemas.microsoft.com/office/word/2016/wordml/cid" xmlns:w16="http://schemas.microsoft.com/office/word/2018/wordml" xmlns:w16sdtdh="http://schemas.microsoft.com/office/word/2020/wordml/sdtdatahash" xmlns:w16se="http://schemas.microsoft.com/office/word/2015/wordml/symex" xmlns:wpg="http://schemas.microsoft.com/office/word/2010/wordprocessingGroup" xmlns:wpi="http://schemas.microsoft.com/office/word/2010/wordprocessingInk" xmlns:wne="http://schemas.microsoft.com/office/word/2006/wordml" xmlns:wps="http://schemas.microsoft.com/office/word/2010/wordprocessingShape" mc:Ignorable="w14 w15 w16se w16cid w16 w16cex w16sdtdh wp14">
+<w:document xmlns:wpc="http://schemas.microsoft.com/office/word/2010/wordprocessingCanvas" xmlns:cx="http://schemas.microsoft.com/office/drawing/2014/chartex" xmlns:cx1="http://schemas.microsoft.com/office/drawing/2015/9/8/chartex" xmlns:cx2="http://schemas.microsoft.com/office/drawing/2015/10/21/chartex" xmlns:cx3="http://schemas.microsoft.com/office/drawing/2016/5/9/chartex" xmlns:cx4="http://schemas.microsoft.com/office/drawing/2016/5/10/chartex" xmlns:cx5="http://schemas.microsoft.com/office/drawing/2016/5/11/chartex" xmlns:cx6="http://schemas.microsoft.com/office/drawing/2016/5/12/chartex" xmlns:cx7="http://schemas.microsoft.com/office/drawing/2016/5/13/chartex" xmlns:cx8="http://schemas.microsoft.com/office/drawing/2016/5/14/chartex" xmlns:mc="http://schemas.openxmlformats.org/markup-compatibility/2006" xmlns:aink="http://schemas.microsoft.com/office/drawing/2016/ink" xmlns:am3d="http://schemas.microsoft.com/office/drawing/2017/model3d" xmlns:o="urn:schemas-microsoft-com:office:office" xmlns:oel="http://schemas.microsoft.com/office/2019/extlst" xmlns:r="http://schemas.openxmlformats.org/officeDocument/2006/relationships" xmlns:m="http://schemas.openxmlformats.org/officeDocument/2006/math" xmlns:v="urn:schemas-microsoft-com:vml" xmlns:wp14="http://schemas.microsoft.com/office/word/2010/wordprocessingDrawing" xmlns:wp="http://schemas.openxmlformats.org/drawingml/2006/wordprocessingDrawing" xmlns:w10="urn:schemas-microsoft-com:office:word" xmlns:w="http://schemas.openxmlformats.org/wordprocessingml/2006/main" xmlns:w14="http://schemas.microsoft.com/office/word/2010/wordml" xmlns:w15="http://schemas.microsoft.com/office/word/2012/wordml" xmlns:w16cex="http://schemas.microsoft.com/office/word/2018/wordml/cex" xmlns:w16cid="http://schemas.microsoft.com/office/word/2016/wordml/cid" xmlns:w16="http://schemas.microsoft.com/office/word/2018/wordml" xmlns:w16du="http://schemas.microsoft.com/office/word/2023/wordml/word16du" xmlns:w16sdtdh="http://schemas.microsoft.com/office/word/2020/wordml/sdtdatahash" xmlns:w16se="http://schemas.microsoft.com/office/word/2015/wordml/symex" xmlns:wpg="http://schemas.microsoft.com/office/word/2010/wordprocessingGroup" xmlns:wpi="http://schemas.microsoft.com/office/word/2010/wordprocessingInk" xmlns:wne="http://schemas.microsoft.com/office/word/2006/wordml" xmlns:wps="http://schemas.microsoft.com/office/word/2010/wordprocessingShape" mc:Ignorable="w14 w15 w16se w16cid w16 w16cex w16sdtdh w16du wp14">
   <w:body>
     <w:p>
       <w:pPr>
@@ -1485,6 +1485,56 @@
           <w:ilvl w:val="1"/>
           <w:numId w:val="3"/>
         </w:numPr>
+      </w:pPr>
+      <w:r>
+        <w:t>Alternatively to the CWNS, you can download the Discharge Monitoring Report (DMR) data from the Enforcement and Compliance History Online (ECHO) database (</w:t>
+      </w:r>
+      <w:hyperlink r:id="rId23" w:history="1">
+        <w:r>
+          <w:rPr>
+            <w:rStyle w:val="Hyperlink"/>
+          </w:rPr>
+          <w:t>https://echo.epa.gov/trends/loading-tool/water-pollution-search</w:t>
+        </w:r>
+      </w:hyperlink>
+      <w:r>
+        <w:t xml:space="preserve">).  </w:t>
+      </w:r>
+    </w:p>
+    <w:p>
+      <w:pPr>
+        <w:pStyle w:val="ListParagraph"/>
+        <w:numPr>
+          <w:ilvl w:val="2"/>
+          <w:numId w:val="3"/>
+        </w:numPr>
+      </w:pPr>
+      <w:r>
+        <w:t>S</w:t>
+      </w:r>
+      <w:r>
+        <w:t xml:space="preserve">et </w:t>
+      </w:r>
+      <w:r>
+        <w:t>the DMR search tool</w:t>
+      </w:r>
+      <w:r>
+        <w:t xml:space="preserve"> to publicly owned facilities only (this is equivalent to municipal facilitie),</w:t>
+      </w:r>
+      <w:r>
+        <w:t xml:space="preserve"> set the year, and then select the wastewater flow under the pollutant categories</w:t>
+      </w:r>
+      <w:r>
+        <w:t>.  After the search, scroll down and download all data.</w:t>
+      </w:r>
+    </w:p>
+    <w:p>
+      <w:pPr>
+        <w:pStyle w:val="ListParagraph"/>
+        <w:numPr>
+          <w:ilvl w:val="1"/>
+          <w:numId w:val="3"/>
+        </w:numPr>
         <w:rPr>
           <w:rStyle w:val="Hyperlink"/>
           <w:color w:val="auto"/>
@@ -1494,7 +1544,7 @@
       <w:r>
         <w:t>Download GHGI (</w:t>
       </w:r>
-      <w:hyperlink r:id="rId23" w:history="1">
+      <w:hyperlink r:id="rId24" w:history="1">
         <w:r>
           <w:rPr>
             <w:rStyle w:val="Hyperlink"/>
@@ -1665,7 +1715,7 @@
       <w:r>
         <w:t>Population estimates are available from the Population and Housing Unit Estimates (</w:t>
       </w:r>
-      <w:hyperlink r:id="rId24" w:history="1">
+      <w:hyperlink r:id="rId25" w:history="1">
         <w:r>
           <w:rPr>
             <w:rStyle w:val="Hyperlink"/>
@@ -1682,7 +1732,7 @@
       <w:r>
         <w:t>data from the most recent census itself are available from the state profiles (</w:t>
       </w:r>
-      <w:hyperlink r:id="rId25" w:history="1">
+      <w:hyperlink r:id="rId26" w:history="1">
         <w:r>
           <w:rPr>
             <w:rStyle w:val="Hyperlink"/>
@@ -1717,7 +1767,7 @@
       <w:r>
         <w:t>urvey table creator (</w:t>
       </w:r>
-      <w:hyperlink r:id="rId26" w:history="1">
+      <w:hyperlink r:id="rId27" w:history="1">
         <w:r>
           <w:rPr>
             <w:rStyle w:val="Hyperlink"/>
@@ -1732,7 +1782,11 @@
         <w:t>sum</w:t>
       </w:r>
       <w:r>
-        <w:t xml:space="preserve"> of those list</w:t>
+        <w:t xml:space="preserve"> of </w:t>
+      </w:r>
+      <w:r>
+        <w:lastRenderedPageBreak/>
+        <w:t>those list</w:t>
       </w:r>
       <w:r>
         <w:t>ed as</w:t>
@@ -1772,7 +1826,7 @@
       <w:r>
         <w:t>For states that were not available in the American Housing Survey, you will have to rely on older census data instead.  The 1990 census is available at (</w:t>
       </w:r>
-      <w:hyperlink r:id="rId27" w:history="1">
+      <w:hyperlink r:id="rId28" w:history="1">
         <w:r>
           <w:rPr>
             <w:rStyle w:val="Hyperlink"/>
@@ -1794,16 +1848,7 @@
           <w:color w:val="auto"/>
           <w:u w:val="none"/>
         </w:rPr>
-        <w:t xml:space="preserve">  You </w:t>
-      </w:r>
-      <w:r>
-        <w:rPr>
-          <w:rStyle w:val="Hyperlink"/>
-          <w:color w:val="auto"/>
-          <w:u w:val="none"/>
-        </w:rPr>
-        <w:lastRenderedPageBreak/>
-        <w:t>will need the percent using septic tank or cesspool for each state of interest and for the nation.</w:t>
+        <w:t xml:space="preserve">  You will need the percent using septic tank or cesspool for each state of interest and for the nation.</w:t>
       </w:r>
     </w:p>
     <w:p>
@@ -1916,7 +1961,7 @@
       <w:r>
         <w:t>Download the NEI (</w:t>
       </w:r>
-      <w:hyperlink r:id="rId28" w:history="1">
+      <w:hyperlink r:id="rId29" w:history="1">
         <w:r>
           <w:rPr>
             <w:rStyle w:val="Hyperlink"/>
@@ -2008,7 +2053,7 @@
       <w:r>
         <w:t>Download GHGI Annexes (</w:t>
       </w:r>
-      <w:hyperlink r:id="rId29" w:history="1">
+      <w:hyperlink r:id="rId30" w:history="1">
         <w:r>
           <w:rPr>
             <w:rStyle w:val="Hyperlink"/>
@@ -2058,7 +2103,7 @@
       <w:r>
         <w:t>Download/View the IPCC default emission factors available in IPCC 2006 vol 2 (</w:t>
       </w:r>
-      <w:hyperlink r:id="rId30" w:history="1">
+      <w:hyperlink r:id="rId31" w:history="1">
         <w:r>
           <w:rPr>
             <w:rStyle w:val="Hyperlink"/>
@@ -2159,7 +2204,7 @@
       <w:r>
         <w:t>This code will automatically download data from the EIA SEDS database (</w:t>
       </w:r>
-      <w:hyperlink r:id="rId31" w:history="1">
+      <w:hyperlink r:id="rId32" w:history="1">
         <w:r>
           <w:rPr>
             <w:rStyle w:val="Hyperlink"/>
@@ -2200,6 +2245,7 @@
         </w:numPr>
       </w:pPr>
       <w:r>
+        <w:lastRenderedPageBreak/>
         <w:t>Before doing anything, checks that Vulcan, ACES, or both are set to be used</w:t>
       </w:r>
     </w:p>
@@ -2244,7 +2290,6 @@
         </w:numPr>
       </w:pPr>
       <w:r>
-        <w:lastRenderedPageBreak/>
         <w:t>The code assumes that cellfrompolygon calculates fractional cover / 100 (i.e., max = 0.01, not 1).  Checks this is the case.</w:t>
       </w:r>
     </w:p>
@@ -2571,7 +2616,7 @@
       <w:r>
         <w:t>Download GHGI Annexes section 3.6: Methodology for Estimating CH4, CO2, and N2O Emissions from Natural Gas Systems xlsx.  For 2022, (</w:t>
       </w:r>
-      <w:hyperlink r:id="rId32" w:history="1">
+      <w:hyperlink r:id="rId33" w:history="1">
         <w:r>
           <w:rPr>
             <w:rStyle w:val="Hyperlink"/>
@@ -2597,7 +2642,7 @@
       <w:r>
         <w:t>(</w:t>
       </w:r>
-      <w:hyperlink r:id="rId33" w:history="1">
+      <w:hyperlink r:id="rId34" w:history="1">
         <w:r>
           <w:rPr>
             <w:rStyle w:val="Hyperlink"/>
@@ -2620,7 +2665,7 @@
       <w:r>
         <w:t>Download Pipeline and Hazardous Materials Safety Administration (PHMSA) gas distribution data (</w:t>
       </w:r>
-      <w:hyperlink r:id="rId34" w:history="1">
+      <w:hyperlink r:id="rId35" w:history="1">
         <w:r>
           <w:rPr>
             <w:rStyle w:val="Hyperlink"/>
@@ -2677,7 +2722,7 @@
       <w:r>
         <w:t>Download the Homeland Infrastructure Foundation-Level Database natural gas service territories (</w:t>
       </w:r>
-      <w:hyperlink r:id="rId35" w:history="1">
+      <w:hyperlink r:id="rId36" w:history="1">
         <w:r>
           <w:rPr>
             <w:rStyle w:val="Hyperlink"/>
@@ -2721,7 +2766,7 @@
       <w:r>
         <w:t>Download the EIA natural gas usage broken down by company (</w:t>
       </w:r>
-      <w:hyperlink r:id="rId36" w:anchor="?report=RP4&amp;year1=2020&amp;year2=2020&amp;company=Name" w:history="1">
+      <w:hyperlink r:id="rId37" w:anchor="?report=RP4&amp;year1=2020&amp;year2=2020&amp;company=Name" w:history="1">
         <w:r>
           <w:rPr>
             <w:rStyle w:val="Hyperlink"/>
@@ -2748,9 +2793,10 @@
         </w:numPr>
       </w:pPr>
       <w:r>
+        <w:lastRenderedPageBreak/>
         <w:t>Download GHGRP data using FLIGHT (</w:t>
       </w:r>
-      <w:hyperlink r:id="rId37" w:history="1">
+      <w:hyperlink r:id="rId38" w:history="1">
         <w:r>
           <w:rPr>
             <w:rStyle w:val="Hyperlink"/>
@@ -2828,35 +2874,275 @@
         </w:numPr>
       </w:pPr>
       <w:r>
+        <w:t>To distribute by LDC:</w:t>
+      </w:r>
+    </w:p>
+    <w:p>
+      <w:pPr>
+        <w:pStyle w:val="ListParagraph"/>
+        <w:numPr>
+          <w:ilvl w:val="2"/>
+          <w:numId w:val="4"/>
+        </w:numPr>
+      </w:pPr>
+      <w:r>
+        <w:t xml:space="preserve">Now all </w:t>
+      </w:r>
+      <w:r>
+        <w:t>the PHMSA, HIFLD, EIA, and GHGRP</w:t>
+      </w:r>
+      <w:r>
+        <w:t xml:space="preserve"> data sets need to be edited to be consistent with one another.  Unfortunately, this cannot be done easily automatically as they don’t report consistent ID’s and names often differ slightly in ways a human can easily identify and a computer cannot.</w:t>
+      </w:r>
+      <w:r>
+        <w:t xml:space="preserve">  You will likely need to look up company information to understand mergers or company’s with multiple names, etc.</w:t>
+      </w:r>
+      <w:r>
+        <w:t xml:space="preserve">  Company websites are provided in some of the files.</w:t>
+      </w:r>
+      <w:r>
+        <w:t xml:space="preserve">  </w:t>
+      </w:r>
+    </w:p>
+    <w:p>
+      <w:pPr>
+        <w:pStyle w:val="ListParagraph"/>
+        <w:numPr>
+          <w:ilvl w:val="3"/>
+          <w:numId w:val="4"/>
+        </w:numPr>
+      </w:pPr>
+      <w:r>
+        <w:t xml:space="preserve">Add a DUMMY variable to the EIA file.  Simply list the same year, but state and company name are dummy, company ID is OTHER.  This is to match facilities without a match in other files (they are all </w:t>
+      </w:r>
+      <w:r>
+        <w:t>summed and distributed to any land without an LDC shapefile in the state</w:t>
+      </w:r>
+      <w:r>
+        <w:t>).</w:t>
+      </w:r>
+      <w:r>
+        <w:t xml:space="preserve">  </w:t>
+      </w:r>
+      <w:r>
+        <w:t>You can filter the file</w:t>
+      </w:r>
+      <w:r>
+        <w:t xml:space="preserve"> by state</w:t>
+      </w:r>
+      <w:r>
+        <w:t xml:space="preserve"> to those of interest</w:t>
+      </w:r>
+      <w:r>
+        <w:t>.</w:t>
+      </w:r>
+    </w:p>
+    <w:p>
+      <w:pPr>
+        <w:pStyle w:val="ListParagraph"/>
+        <w:numPr>
+          <w:ilvl w:val="3"/>
+          <w:numId w:val="4"/>
+        </w:numPr>
+      </w:pPr>
+      <w:r>
+        <w:t>Add a Company ID column to GHGRP and list the EIA ID for each facility</w:t>
+      </w:r>
+      <w:r>
+        <w:t>.  You can filter the file by state to those of interest.</w:t>
+      </w:r>
+    </w:p>
+    <w:p>
+      <w:pPr>
+        <w:pStyle w:val="ListParagraph"/>
+        <w:numPr>
+          <w:ilvl w:val="3"/>
+          <w:numId w:val="4"/>
+        </w:numPr>
+      </w:pPr>
+      <w:r>
+        <w:t xml:space="preserve">Add a Company_ID column to PHMSA and list the EIA ID for each facility.  If the facility </w:t>
+      </w:r>
+      <w:r>
+        <w:t>doesn’t have a match in HIFLD and/or EIA</w:t>
+      </w:r>
+      <w:r>
+        <w:t xml:space="preserve"> this should be set to OTHER.  </w:t>
+      </w:r>
+      <w:r>
+        <w:t>You can filter</w:t>
+      </w:r>
+      <w:r>
+        <w:t xml:space="preserve"> by STOP </w:t>
+      </w:r>
+      <w:r>
+        <w:t xml:space="preserve">to the states of interest </w:t>
+      </w:r>
+      <w:r>
+        <w:t xml:space="preserve">and </w:t>
+      </w:r>
+      <w:r>
+        <w:t xml:space="preserve">should </w:t>
+      </w:r>
+      <w:r>
+        <w:t xml:space="preserve">filter to </w:t>
+      </w:r>
+      <w:r>
+        <w:t>natural gas (NG)</w:t>
+      </w:r>
+      <w:r>
+        <w:t xml:space="preserve"> as the Commodity.</w:t>
+      </w:r>
+    </w:p>
+    <w:p>
+      <w:pPr>
+        <w:pStyle w:val="ListParagraph"/>
+        <w:numPr>
+          <w:ilvl w:val="3"/>
+          <w:numId w:val="4"/>
+        </w:numPr>
+      </w:pPr>
+      <w:r>
+        <w:t>A</w:t>
+      </w:r>
+      <w:r>
+        <w:t xml:space="preserve">dd a row </w:t>
+      </w:r>
+      <w:r>
+        <w:t xml:space="preserve">to HIFLD </w:t>
+      </w:r>
+      <w:r>
+        <w:t>with “OTHER” in th</w:t>
+      </w:r>
+      <w:r>
+        <w:t>e</w:t>
+      </w:r>
+      <w:r>
+        <w:t xml:space="preserve"> COMPID column</w:t>
+      </w:r>
+      <w:r>
+        <w:t xml:space="preserve"> and DUMMY for the objected, svcterid, and name</w:t>
+      </w:r>
+      <w:r>
+        <w:t>.</w:t>
+      </w:r>
+      <w:r>
+        <w:t xml:space="preserve">  </w:t>
+      </w:r>
+      <w:r>
+        <w:t xml:space="preserve">Compare the HIFLD COMPID to the EIA IDs and correct any that differ.  </w:t>
+      </w:r>
+      <w:r>
+        <w:t xml:space="preserve">Remove </w:t>
+      </w:r>
+      <w:r>
+        <w:t>COMPID for any</w:t>
+      </w:r>
+      <w:r>
+        <w:t xml:space="preserve"> HIFLD facilities that aren’t in the EIA dataset</w:t>
+      </w:r>
+      <w:r>
+        <w:t xml:space="preserve"> (they will </w:t>
+      </w:r>
+      <w:r>
+        <w:t xml:space="preserve">then </w:t>
+      </w:r>
+      <w:r>
+        <w:t>be removed by the code)</w:t>
+      </w:r>
+      <w:r>
+        <w:t xml:space="preserve">.  </w:t>
+      </w:r>
+      <w:r>
+        <w:t>You can filter the file by LDC_state to just the states of interest</w:t>
+      </w:r>
+      <w:r>
+        <w:t>.</w:t>
+      </w:r>
+    </w:p>
+    <w:p>
+      <w:pPr>
+        <w:pStyle w:val="ListParagraph"/>
+        <w:numPr>
+          <w:ilvl w:val="3"/>
+          <w:numId w:val="4"/>
+        </w:numPr>
+      </w:pPr>
+      <w:r>
+        <w:t>In addition to these comparisons, you should compare the GHGRP and HIFLD shapefiles</w:t>
+      </w:r>
+      <w:r>
+        <w:t>.  The R code has a section to plot the HIFLD shapefiles 1 state or LDC at a time.  The GHGRP FLIGHT website can be used to visualize the GHGRP shapefiles.</w:t>
+      </w:r>
+    </w:p>
+    <w:p>
+      <w:pPr>
+        <w:pStyle w:val="ListParagraph"/>
+        <w:numPr>
+          <w:ilvl w:val="3"/>
+          <w:numId w:val="4"/>
+        </w:numPr>
+      </w:pPr>
+      <w:r>
+        <w:t xml:space="preserve">Also be aware that some LDC’s cross state lines.  Although they should have separate entries for each state this may not necessarily be the case across all files.  </w:t>
+      </w:r>
+      <w:r>
+        <w:t xml:space="preserve">This seems to mostly </w:t>
+      </w:r>
+      <w:r>
+        <w:t xml:space="preserve">be </w:t>
+      </w:r>
+      <w:r>
+        <w:t>an issue for GHGRP.</w:t>
+      </w:r>
+      <w:r>
+        <w:t xml:space="preserve">  If you set “browse to a State” to "choose state" you will get data for all states so that LDCs that don’t list the state the operate in will still be easily identifiable on the map.</w:t>
+      </w:r>
+    </w:p>
+    <w:p>
+      <w:pPr>
+        <w:pStyle w:val="ListParagraph"/>
+        <w:numPr>
+          <w:ilvl w:val="4"/>
+          <w:numId w:val="4"/>
+        </w:numPr>
+      </w:pPr>
+      <w:r>
+        <w:t xml:space="preserve">E.g., The LDC Washington Gas operates in DC, MD, and VA, however the MD HIFLD shapefile includes some VA data.  GHGRP also lists all 3 as VA LDCs.   </w:t>
+      </w:r>
+    </w:p>
+    <w:p>
+      <w:pPr>
+        <w:pStyle w:val="ListParagraph"/>
+        <w:numPr>
+          <w:ilvl w:val="4"/>
+          <w:numId w:val="4"/>
+        </w:numPr>
+      </w:pPr>
+      <w:r>
+        <w:t xml:space="preserve">Another example, several LDCs list IN as their state in GHGRP even though they </w:t>
+      </w:r>
+      <w:r>
+        <w:t xml:space="preserve">exclusively </w:t>
+      </w:r>
+      <w:r>
+        <w:t xml:space="preserve">cover other states (Columbia gas of </w:t>
+      </w:r>
+      <w:r>
         <w:lastRenderedPageBreak/>
-        <w:t>To distribute by LDC:</w:t>
-      </w:r>
-    </w:p>
-    <w:p>
-      <w:pPr>
-        <w:pStyle w:val="ListParagraph"/>
-        <w:numPr>
-          <w:ilvl w:val="2"/>
-          <w:numId w:val="4"/>
-        </w:numPr>
-      </w:pPr>
-      <w:r>
-        <w:t xml:space="preserve">Now all </w:t>
-      </w:r>
-      <w:r>
-        <w:t>the PHMSA, HIFLD, EIA, and GHGRP</w:t>
-      </w:r>
-      <w:r>
-        <w:t xml:space="preserve"> data sets need to be edited to be consistent with one another.  Unfortunately, this cannot be done easily automatically as they don’t report consistent ID’s and names often differ slightly in ways a human can easily identify and a computer cannot.</w:t>
-      </w:r>
-      <w:r>
-        <w:t xml:space="preserve">  You will likely need to look up company information to understand mergers or company’s with multiple names, etc.</w:t>
-      </w:r>
-      <w:r>
-        <w:t xml:space="preserve">  Company websites are provided in some of the files.</w:t>
-      </w:r>
-      <w:r>
-        <w:t xml:space="preserve">  </w:t>
+        <w:t xml:space="preserve">PA, Vectren of Ohio, etc.).  The code filters to the states of interest, so change the state in the </w:t>
+      </w:r>
+      <w:r>
+        <w:t xml:space="preserve">input </w:t>
+      </w:r>
+      <w:r>
+        <w:t xml:space="preserve">file </w:t>
+      </w:r>
+      <w:r>
+        <w:t xml:space="preserve">to a state of interest </w:t>
+      </w:r>
+      <w:r>
+        <w:t>if this situation occurs.</w:t>
       </w:r>
     </w:p>
     <w:p>
@@ -2868,190 +3154,7 @@
         </w:numPr>
       </w:pPr>
       <w:r>
-        <w:t xml:space="preserve">Add a DUMMY variable to the EIA file.  Simply list the same year, but state and company name are dummy, company ID is OTHER.  This is to match facilities without a match in other files (they are all </w:t>
-      </w:r>
-      <w:r>
-        <w:t>summed and distributed to any land without an LDC shapefile in the state</w:t>
-      </w:r>
-      <w:r>
-        <w:t>).</w:t>
-      </w:r>
-      <w:r>
-        <w:t xml:space="preserve">  </w:t>
-      </w:r>
-      <w:r>
-        <w:t>You can filter the file</w:t>
-      </w:r>
-      <w:r>
-        <w:t xml:space="preserve"> by state</w:t>
-      </w:r>
-      <w:r>
-        <w:t xml:space="preserve"> to those of interest</w:t>
-      </w:r>
-      <w:r>
-        <w:t>.</w:t>
-      </w:r>
-    </w:p>
-    <w:p>
-      <w:pPr>
-        <w:pStyle w:val="ListParagraph"/>
-        <w:numPr>
-          <w:ilvl w:val="3"/>
-          <w:numId w:val="4"/>
-        </w:numPr>
-      </w:pPr>
-      <w:r>
-        <w:t>Add a Company ID column to GHGRP and list the EIA ID for each facility</w:t>
-      </w:r>
-      <w:r>
-        <w:t>.  You can filter the file by state to those of interest.</w:t>
-      </w:r>
-    </w:p>
-    <w:p>
-      <w:pPr>
-        <w:pStyle w:val="ListParagraph"/>
-        <w:numPr>
-          <w:ilvl w:val="3"/>
-          <w:numId w:val="4"/>
-        </w:numPr>
-      </w:pPr>
-      <w:r>
-        <w:t xml:space="preserve">Add a Company_ID column to PHMSA and list the EIA ID for each facility.  If the facility </w:t>
-      </w:r>
-      <w:r>
-        <w:t>doesn’t have a match in HIFLD and/or EIA</w:t>
-      </w:r>
-      <w:r>
-        <w:t xml:space="preserve"> this should be set to OTHER.  </w:t>
-      </w:r>
-      <w:r>
-        <w:t>You can filter</w:t>
-      </w:r>
-      <w:r>
-        <w:t xml:space="preserve"> by STOP </w:t>
-      </w:r>
-      <w:r>
-        <w:t xml:space="preserve">to the states of interest </w:t>
-      </w:r>
-      <w:r>
-        <w:t xml:space="preserve">and </w:t>
-      </w:r>
-      <w:r>
-        <w:t xml:space="preserve">should </w:t>
-      </w:r>
-      <w:r>
-        <w:t xml:space="preserve">filter to </w:t>
-      </w:r>
-      <w:r>
-        <w:t>natural gas (NG)</w:t>
-      </w:r>
-      <w:r>
-        <w:t xml:space="preserve"> as the Commodity.</w:t>
-      </w:r>
-    </w:p>
-    <w:p>
-      <w:pPr>
-        <w:pStyle w:val="ListParagraph"/>
-        <w:numPr>
-          <w:ilvl w:val="3"/>
-          <w:numId w:val="4"/>
-        </w:numPr>
-      </w:pPr>
-      <w:r>
-        <w:t>A</w:t>
-      </w:r>
-      <w:r>
-        <w:t xml:space="preserve">dd a row </w:t>
-      </w:r>
-      <w:r>
-        <w:t xml:space="preserve">to HIFLD </w:t>
-      </w:r>
-      <w:r>
-        <w:t>with “OTHER” in th</w:t>
-      </w:r>
-      <w:r>
-        <w:t>e</w:t>
-      </w:r>
-      <w:r>
-        <w:t xml:space="preserve"> COMPID column</w:t>
-      </w:r>
-      <w:r>
-        <w:t xml:space="preserve"> and DUMMY for the objected, svcterid, and name</w:t>
-      </w:r>
-      <w:r>
-        <w:t>.</w:t>
-      </w:r>
-      <w:r>
-        <w:t xml:space="preserve">  </w:t>
-      </w:r>
-      <w:r>
-        <w:t xml:space="preserve">Compare the HIFLD COMPID to the EIA IDs and correct any that differ.  </w:t>
-      </w:r>
-      <w:r>
-        <w:t xml:space="preserve">Remove </w:t>
-      </w:r>
-      <w:r>
-        <w:t>COMPID for any</w:t>
-      </w:r>
-      <w:r>
-        <w:t xml:space="preserve"> HIFLD facilities that aren’t in the EIA dataset</w:t>
-      </w:r>
-      <w:r>
-        <w:t xml:space="preserve"> (they will </w:t>
-      </w:r>
-      <w:r>
-        <w:t xml:space="preserve">then </w:t>
-      </w:r>
-      <w:r>
-        <w:t>be removed by the code)</w:t>
-      </w:r>
-      <w:r>
-        <w:t xml:space="preserve">.  </w:t>
-      </w:r>
-      <w:r>
-        <w:t>You can filter the file by LDC_state to just the states of interest</w:t>
-      </w:r>
-      <w:r>
-        <w:t>.</w:t>
-      </w:r>
-    </w:p>
-    <w:p>
-      <w:pPr>
-        <w:pStyle w:val="ListParagraph"/>
-        <w:numPr>
-          <w:ilvl w:val="3"/>
-          <w:numId w:val="4"/>
-        </w:numPr>
-      </w:pPr>
-      <w:r>
-        <w:t>In addition to these comparisons, you should compare the GHGRP and HIFLD shapefiles</w:t>
-      </w:r>
-      <w:r>
-        <w:t>.  The R code has a section to plot the HIFLD shapefiles 1 state or LDC at a time.  The GHGRP FLIGHT website can be used to visualize the GHGRP shapefiles.</w:t>
-      </w:r>
-    </w:p>
-    <w:p>
-      <w:pPr>
-        <w:pStyle w:val="ListParagraph"/>
-        <w:numPr>
-          <w:ilvl w:val="3"/>
-          <w:numId w:val="4"/>
-        </w:numPr>
-      </w:pPr>
-      <w:r>
-        <w:t xml:space="preserve">Also be aware that some LDC’s cross state lines.  Although they should have separate entries for each state this may not necessarily be the case across all files.  </w:t>
-      </w:r>
-      <w:r>
-        <w:t xml:space="preserve">This seems to mostly </w:t>
-      </w:r>
-      <w:r>
-        <w:t xml:space="preserve">be </w:t>
-      </w:r>
-      <w:r>
-        <w:t>an issue for GHGRP.</w:t>
-      </w:r>
-      <w:r>
-        <w:t xml:space="preserve">  If you set “browse to a State” to "choose state" you will get data for all states so that LDCs that don’t list the state the operate in will still be easily identifiable on the map.</w:t>
+        <w:t>Files</w:t>
       </w:r>
     </w:p>
     <w:p>
@@ -3063,7 +3166,7 @@
         </w:numPr>
       </w:pPr>
       <w:r>
-        <w:t xml:space="preserve">E.g., The LDC Washington Gas operates in DC, MD, and VA, however the MD HIFLD shapefile includes some VA data.  GHGRP also lists all 3 as VA LDCs.   </w:t>
+        <w:t>PHMSA = annual gas distribution</w:t>
       </w:r>
     </w:p>
     <w:p>
@@ -3075,37 +3178,7 @@
         </w:numPr>
       </w:pPr>
       <w:r>
-        <w:t xml:space="preserve">Another example, several LDCs list IN as their state in GHGRP even though they </w:t>
-      </w:r>
-      <w:r>
-        <w:t xml:space="preserve">exclusively </w:t>
-      </w:r>
-      <w:r>
-        <w:t xml:space="preserve">cover other states (Columbia gas of PA, Vectren of Ohio, etc.).  The code filters to the states of interest, so change the state in the </w:t>
-      </w:r>
-      <w:r>
-        <w:t xml:space="preserve">input </w:t>
-      </w:r>
-      <w:r>
-        <w:t xml:space="preserve">file </w:t>
-      </w:r>
-      <w:r>
-        <w:t xml:space="preserve">to a state of interest </w:t>
-      </w:r>
-      <w:r>
-        <w:t>if this situation occurs.</w:t>
-      </w:r>
-    </w:p>
-    <w:p>
-      <w:pPr>
-        <w:pStyle w:val="ListParagraph"/>
-        <w:numPr>
-          <w:ilvl w:val="3"/>
-          <w:numId w:val="4"/>
-        </w:numPr>
-      </w:pPr>
-      <w:r>
-        <w:t>Files</w:t>
+        <w:t>HFILD = NG service territories</w:t>
       </w:r>
     </w:p>
     <w:p>
@@ -3117,31 +3190,6 @@
         </w:numPr>
       </w:pPr>
       <w:r>
-        <w:t>PHMSA = annual gas distribution</w:t>
-      </w:r>
-    </w:p>
-    <w:p>
-      <w:pPr>
-        <w:pStyle w:val="ListParagraph"/>
-        <w:numPr>
-          <w:ilvl w:val="4"/>
-          <w:numId w:val="4"/>
-        </w:numPr>
-      </w:pPr>
-      <w:r>
-        <w:t>HFILD = NG service territories</w:t>
-      </w:r>
-    </w:p>
-    <w:p>
-      <w:pPr>
-        <w:pStyle w:val="ListParagraph"/>
-        <w:numPr>
-          <w:ilvl w:val="4"/>
-          <w:numId w:val="4"/>
-        </w:numPr>
-      </w:pPr>
-      <w:r>
-        <w:lastRenderedPageBreak/>
         <w:t>EIA = 176 Type of Operations</w:t>
       </w:r>
     </w:p>
@@ -3449,6 +3497,7 @@
         </w:numPr>
       </w:pPr>
       <w:r>
+        <w:lastRenderedPageBreak/>
         <w:t xml:space="preserve">Download </w:t>
       </w:r>
       <w:r>
@@ -3457,7 +3506,7 @@
       <w:r>
         <w:t>(</w:t>
       </w:r>
-      <w:hyperlink r:id="rId38" w:history="1">
+      <w:hyperlink r:id="rId39" w:history="1">
         <w:r>
           <w:rPr>
             <w:rStyle w:val="Hyperlink"/>
@@ -3508,10 +3557,9 @@
         </w:numPr>
       </w:pPr>
       <w:r>
-        <w:lastRenderedPageBreak/>
         <w:t xml:space="preserve">NLCD – </w:t>
       </w:r>
-      <w:hyperlink r:id="rId39" w:history="1">
+      <w:hyperlink r:id="rId40" w:history="1">
         <w:r>
           <w:rPr>
             <w:rStyle w:val="Hyperlink"/>
@@ -3534,7 +3582,7 @@
       <w:r>
         <w:t xml:space="preserve">NALCMS – </w:t>
       </w:r>
-      <w:hyperlink r:id="rId40" w:history="1">
+      <w:hyperlink r:id="rId41" w:history="1">
         <w:r>
           <w:rPr>
             <w:rStyle w:val="Hyperlink"/>
@@ -3652,7 +3700,7 @@
       <w:r>
         <w:t>The code will automatically download National Wetland Inventory (NWI) shapefiles from (</w:t>
       </w:r>
-      <w:hyperlink r:id="rId41" w:history="1">
+      <w:hyperlink r:id="rId42" w:history="1">
         <w:r>
           <w:rPr>
             <w:rStyle w:val="Hyperlink"/>
@@ -3877,7 +3925,7 @@
 </file>
 
 <file path=word/numbering.xml><?xml version="1.0" encoding="utf-8"?>
-<w:numbering xmlns:wpc="http://schemas.microsoft.com/office/word/2010/wordprocessingCanvas" xmlns:cx="http://schemas.microsoft.com/office/drawing/2014/chartex" xmlns:cx1="http://schemas.microsoft.com/office/drawing/2015/9/8/chartex" xmlns:cx2="http://schemas.microsoft.com/office/drawing/2015/10/21/chartex" xmlns:cx3="http://schemas.microsoft.com/office/drawing/2016/5/9/chartex" xmlns:cx4="http://schemas.microsoft.com/office/drawing/2016/5/10/chartex" xmlns:cx5="http://schemas.microsoft.com/office/drawing/2016/5/11/chartex" xmlns:cx6="http://schemas.microsoft.com/office/drawing/2016/5/12/chartex" xmlns:cx7="http://schemas.microsoft.com/office/drawing/2016/5/13/chartex" xmlns:cx8="http://schemas.microsoft.com/office/drawing/2016/5/14/chartex" xmlns:mc="http://schemas.openxmlformats.org/markup-compatibility/2006" xmlns:aink="http://schemas.microsoft.com/office/drawing/2016/ink" xmlns:am3d="http://schemas.microsoft.com/office/drawing/2017/model3d" xmlns:o="urn:schemas-microsoft-com:office:office" xmlns:oel="http://schemas.microsoft.com/office/2019/extlst" xmlns:r="http://schemas.openxmlformats.org/officeDocument/2006/relationships" xmlns:m="http://schemas.openxmlformats.org/officeDocument/2006/math" xmlns:v="urn:schemas-microsoft-com:vml" xmlns:wp14="http://schemas.microsoft.com/office/word/2010/wordprocessingDrawing" xmlns:wp="http://schemas.openxmlformats.org/drawingml/2006/wordprocessingDrawing" xmlns:w10="urn:schemas-microsoft-com:office:word" xmlns:w="http://schemas.openxmlformats.org/wordprocessingml/2006/main" xmlns:w14="http://schemas.microsoft.com/office/word/2010/wordml" xmlns:w15="http://schemas.microsoft.com/office/word/2012/wordml" xmlns:w16cex="http://schemas.microsoft.com/office/word/2018/wordml/cex" xmlns:w16cid="http://schemas.microsoft.com/office/word/2016/wordml/cid" xmlns:w16="http://schemas.microsoft.com/office/word/2018/wordml" xmlns:w16sdtdh="http://schemas.microsoft.com/office/word/2020/wordml/sdtdatahash" xmlns:w16se="http://schemas.microsoft.com/office/word/2015/wordml/symex" xmlns:wpg="http://schemas.microsoft.com/office/word/2010/wordprocessingGroup" xmlns:wpi="http://schemas.microsoft.com/office/word/2010/wordprocessingInk" xmlns:wne="http://schemas.microsoft.com/office/word/2006/wordml" xmlns:wps="http://schemas.microsoft.com/office/word/2010/wordprocessingShape" mc:Ignorable="w14 w15 w16se w16cid w16 w16cex w16sdtdh wp14">
+<w:numbering xmlns:wpc="http://schemas.microsoft.com/office/word/2010/wordprocessingCanvas" xmlns:cx="http://schemas.microsoft.com/office/drawing/2014/chartex" xmlns:cx1="http://schemas.microsoft.com/office/drawing/2015/9/8/chartex" xmlns:cx2="http://schemas.microsoft.com/office/drawing/2015/10/21/chartex" xmlns:cx3="http://schemas.microsoft.com/office/drawing/2016/5/9/chartex" xmlns:cx4="http://schemas.microsoft.com/office/drawing/2016/5/10/chartex" xmlns:cx5="http://schemas.microsoft.com/office/drawing/2016/5/11/chartex" xmlns:cx6="http://schemas.microsoft.com/office/drawing/2016/5/12/chartex" xmlns:cx7="http://schemas.microsoft.com/office/drawing/2016/5/13/chartex" xmlns:cx8="http://schemas.microsoft.com/office/drawing/2016/5/14/chartex" xmlns:mc="http://schemas.openxmlformats.org/markup-compatibility/2006" xmlns:aink="http://schemas.microsoft.com/office/drawing/2016/ink" xmlns:am3d="http://schemas.microsoft.com/office/drawing/2017/model3d" xmlns:o="urn:schemas-microsoft-com:office:office" xmlns:oel="http://schemas.microsoft.com/office/2019/extlst" xmlns:r="http://schemas.openxmlformats.org/officeDocument/2006/relationships" xmlns:m="http://schemas.openxmlformats.org/officeDocument/2006/math" xmlns:v="urn:schemas-microsoft-com:vml" xmlns:wp14="http://schemas.microsoft.com/office/word/2010/wordprocessingDrawing" xmlns:wp="http://schemas.openxmlformats.org/drawingml/2006/wordprocessingDrawing" xmlns:w10="urn:schemas-microsoft-com:office:word" xmlns:w="http://schemas.openxmlformats.org/wordprocessingml/2006/main" xmlns:w14="http://schemas.microsoft.com/office/word/2010/wordml" xmlns:w15="http://schemas.microsoft.com/office/word/2012/wordml" xmlns:w16cex="http://schemas.microsoft.com/office/word/2018/wordml/cex" xmlns:w16cid="http://schemas.microsoft.com/office/word/2016/wordml/cid" xmlns:w16="http://schemas.microsoft.com/office/word/2018/wordml" xmlns:w16du="http://schemas.microsoft.com/office/word/2023/wordml/word16du" xmlns:w16sdtdh="http://schemas.microsoft.com/office/word/2020/wordml/sdtdatahash" xmlns:w16se="http://schemas.microsoft.com/office/word/2015/wordml/symex" xmlns:wpg="http://schemas.microsoft.com/office/word/2010/wordprocessingGroup" xmlns:wpi="http://schemas.microsoft.com/office/word/2010/wordprocessingInk" xmlns:wne="http://schemas.microsoft.com/office/word/2006/wordml" xmlns:wps="http://schemas.microsoft.com/office/word/2010/wordprocessingShape" mc:Ignorable="w14 w15 w16se w16cid w16 w16cex w16sdtdh w16du wp14">
   <w:abstractNum w:abstractNumId="0" w15:restartNumberingAfterBreak="0">
     <w:nsid w:val="16B54E14"/>
     <w:multiLevelType w:val="hybridMultilevel"/>
@@ -4462,7 +4510,7 @@
 </file>
 
 <file path=word/styles.xml><?xml version="1.0" encoding="utf-8"?>
-<w:styles xmlns:mc="http://schemas.openxmlformats.org/markup-compatibility/2006" xmlns:r="http://schemas.openxmlformats.org/officeDocument/2006/relationships" xmlns:w="http://schemas.openxmlformats.org/wordprocessingml/2006/main" xmlns:w14="http://schemas.microsoft.com/office/word/2010/wordml" xmlns:w15="http://schemas.microsoft.com/office/word/2012/wordml" xmlns:w16cex="http://schemas.microsoft.com/office/word/2018/wordml/cex" xmlns:w16cid="http://schemas.microsoft.com/office/word/2016/wordml/cid" xmlns:w16="http://schemas.microsoft.com/office/word/2018/wordml" xmlns:w16sdtdh="http://schemas.microsoft.com/office/word/2020/wordml/sdtdatahash" xmlns:w16se="http://schemas.microsoft.com/office/word/2015/wordml/symex" mc:Ignorable="w14 w15 w16se w16cid w16 w16cex w16sdtdh">
+<w:styles xmlns:mc="http://schemas.openxmlformats.org/markup-compatibility/2006" xmlns:r="http://schemas.openxmlformats.org/officeDocument/2006/relationships" xmlns:w="http://schemas.openxmlformats.org/wordprocessingml/2006/main" xmlns:w14="http://schemas.microsoft.com/office/word/2010/wordml" xmlns:w15="http://schemas.microsoft.com/office/word/2012/wordml" xmlns:w16cex="http://schemas.microsoft.com/office/word/2018/wordml/cex" xmlns:w16cid="http://schemas.microsoft.com/office/word/2016/wordml/cid" xmlns:w16="http://schemas.microsoft.com/office/word/2018/wordml" xmlns:w16du="http://schemas.microsoft.com/office/word/2023/wordml/word16du" xmlns:w16sdtdh="http://schemas.microsoft.com/office/word/2020/wordml/sdtdatahash" xmlns:w16se="http://schemas.microsoft.com/office/word/2015/wordml/symex" mc:Ignorable="w14 w15 w16se w16cid w16 w16cex w16sdtdh w16du">
   <w:docDefaults>
     <w:rPrDefault>
       <w:rPr>

</xml_diff>